<commit_message>
Add dwsync.xml file with image file synchronization details for August
</commit_message>
<xml_diff>
--- a/Articles/2026/4_Blender_Tips_and_Tricks/4_ Mirror_a_Reference_image_facing_the_Wrong_Way/3 Mirror a Reference image facing the Wrong Way.docx
+++ b/Articles/2026/4_Blender_Tips_and_Tricks/4_ Mirror_a_Reference_image_facing_the_Wrong_Way/3 Mirror a Reference image facing the Wrong Way.docx
@@ -15,6 +15,94 @@
         <w:t>9-28-2026</w:t>
       </w:r>
     </w:p>
+    <w:p/>
+    <w:p>
+      <w:r>
+        <w:rPr>
+          <w:noProof/>
+        </w:rPr>
+        <w:drawing>
+          <wp:inline distT="0" distB="0" distL="0" distR="0" wp14:anchorId="7D58E38D" wp14:editId="582FA43A">
+            <wp:extent cx="3514725" cy="3137218"/>
+            <wp:effectExtent l="76200" t="76200" r="123825" b="139700"/>
+            <wp:docPr id="1231501187" name="Picture 1"/>
+            <wp:cNvGraphicFramePr>
+              <a:graphicFrameLocks xmlns:a="http://schemas.openxmlformats.org/drawingml/2006/main" noChangeAspect="1"/>
+            </wp:cNvGraphicFramePr>
+            <a:graphic xmlns:a="http://schemas.openxmlformats.org/drawingml/2006/main">
+              <a:graphicData uri="http://schemas.openxmlformats.org/drawingml/2006/picture">
+                <pic:pic xmlns:pic="http://schemas.openxmlformats.org/drawingml/2006/picture">
+                  <pic:nvPicPr>
+                    <pic:cNvPr id="0" name="Picture 1"/>
+                    <pic:cNvPicPr>
+                      <a:picLocks noChangeAspect="1" noChangeArrowheads="1"/>
+                    </pic:cNvPicPr>
+                  </pic:nvPicPr>
+                  <pic:blipFill>
+                    <a:blip r:embed="rId7">
+                      <a:extLst>
+                        <a:ext uri="{28A0092B-C50C-407E-A947-70E740481C1C}">
+                          <a14:useLocalDpi xmlns:a14="http://schemas.microsoft.com/office/drawing/2010/main" val="0"/>
+                        </a:ext>
+                      </a:extLst>
+                    </a:blip>
+                    <a:srcRect/>
+                    <a:stretch>
+                      <a:fillRect/>
+                    </a:stretch>
+                  </pic:blipFill>
+                  <pic:spPr bwMode="auto">
+                    <a:xfrm>
+                      <a:off x="0" y="0"/>
+                      <a:ext cx="3521585" cy="3143342"/>
+                    </a:xfrm>
+                    <a:prstGeom prst="rect">
+                      <a:avLst/>
+                    </a:prstGeom>
+                    <a:ln w="38100" cap="sq">
+                      <a:solidFill>
+                        <a:srgbClr val="000000"/>
+                      </a:solidFill>
+                      <a:prstDash val="solid"/>
+                      <a:miter lim="800000"/>
+                    </a:ln>
+                    <a:effectLst>
+                      <a:outerShdw blurRad="50800" dist="38100" dir="2700000" algn="tl" rotWithShape="0">
+                        <a:srgbClr val="000000">
+                          <a:alpha val="43000"/>
+                        </a:srgbClr>
+                      </a:outerShdw>
+                    </a:effectLst>
+                  </pic:spPr>
+                </pic:pic>
+              </a:graphicData>
+            </a:graphic>
+          </wp:inline>
+        </w:drawing>
+      </w:r>
+    </w:p>
+    <w:p>
+      <w:pPr>
+        <w:spacing w:before="100" w:beforeAutospacing="1" w:after="100" w:afterAutospacing="1" w:line="240" w:lineRule="auto"/>
+        <w:rPr>
+          <w:rFonts w:ascii="Times New Roman" w:eastAsia="Times New Roman" w:hAnsi="Times New Roman" w:cs="Times New Roman"/>
+          <w:kern w:val="0"/>
+          <w:sz w:val="24"/>
+          <w:szCs w:val="24"/>
+          <w14:ligatures w14:val="none"/>
+        </w:rPr>
+      </w:pPr>
+      <w:r>
+        <w:rPr>
+          <w:rFonts w:ascii="Times New Roman" w:eastAsia="Times New Roman" w:hAnsi="Times New Roman" w:cs="Times New Roman"/>
+          <w:kern w:val="0"/>
+          <w:sz w:val="24"/>
+          <w:szCs w:val="24"/>
+          <w14:ligatures w14:val="none"/>
+        </w:rPr>
+        <w:t>Let’s say that the reference image came in like this. Wow, that’s not right. The robot half is supposed to be on Awedae’s left side, not his right side.</w:t>
+      </w:r>
+    </w:p>
     <w:p>
       <w:pPr>
         <w:numPr>
@@ -43,6 +131,77 @@
     </w:p>
     <w:p>
       <w:pPr>
+        <w:spacing w:before="100" w:beforeAutospacing="1" w:after="100" w:afterAutospacing="1" w:line="240" w:lineRule="auto"/>
+        <w:rPr>
+          <w:rFonts w:ascii="Times New Roman" w:eastAsia="Times New Roman" w:hAnsi="Times New Roman" w:cs="Times New Roman"/>
+          <w:kern w:val="0"/>
+          <w:sz w:val="24"/>
+          <w:szCs w:val="24"/>
+          <w14:ligatures w14:val="none"/>
+        </w:rPr>
+      </w:pPr>
+      <w:r>
+        <w:rPr>
+          <w:rFonts w:ascii="Times New Roman" w:eastAsia="Times New Roman" w:hAnsi="Times New Roman" w:cs="Times New Roman"/>
+          <w:noProof/>
+          <w:kern w:val="0"/>
+          <w:sz w:val="24"/>
+          <w:szCs w:val="24"/>
+          <w14:ligatures w14:val="none"/>
+        </w:rPr>
+        <w:drawing>
+          <wp:inline distT="0" distB="0" distL="0" distR="0" wp14:anchorId="730FED0E" wp14:editId="21F10DE0">
+            <wp:extent cx="2428126" cy="3038475"/>
+            <wp:effectExtent l="76200" t="76200" r="125095" b="123825"/>
+            <wp:docPr id="77355926" name="Picture 1"/>
+            <wp:cNvGraphicFramePr>
+              <a:graphicFrameLocks xmlns:a="http://schemas.openxmlformats.org/drawingml/2006/main" noChangeAspect="1"/>
+            </wp:cNvGraphicFramePr>
+            <a:graphic xmlns:a="http://schemas.openxmlformats.org/drawingml/2006/main">
+              <a:graphicData uri="http://schemas.openxmlformats.org/drawingml/2006/picture">
+                <pic:pic xmlns:pic="http://schemas.openxmlformats.org/drawingml/2006/picture">
+                  <pic:nvPicPr>
+                    <pic:cNvPr id="77355926" name=""/>
+                    <pic:cNvPicPr/>
+                  </pic:nvPicPr>
+                  <pic:blipFill>
+                    <a:blip r:embed="rId8"/>
+                    <a:stretch>
+                      <a:fillRect/>
+                    </a:stretch>
+                  </pic:blipFill>
+                  <pic:spPr>
+                    <a:xfrm>
+                      <a:off x="0" y="0"/>
+                      <a:ext cx="2432471" cy="3043912"/>
+                    </a:xfrm>
+                    <a:prstGeom prst="rect">
+                      <a:avLst/>
+                    </a:prstGeom>
+                    <a:ln w="38100" cap="sq">
+                      <a:solidFill>
+                        <a:srgbClr val="000000"/>
+                      </a:solidFill>
+                      <a:prstDash val="solid"/>
+                      <a:miter lim="800000"/>
+                    </a:ln>
+                    <a:effectLst>
+                      <a:outerShdw blurRad="50800" dist="38100" dir="2700000" algn="tl" rotWithShape="0">
+                        <a:srgbClr val="000000">
+                          <a:alpha val="43000"/>
+                        </a:srgbClr>
+                      </a:outerShdw>
+                    </a:effectLst>
+                  </pic:spPr>
+                </pic:pic>
+              </a:graphicData>
+            </a:graphic>
+          </wp:inline>
+        </w:drawing>
+      </w:r>
+    </w:p>
+    <w:p>
+      <w:pPr>
         <w:numPr>
           <w:ilvl w:val="0"/>
           <w:numId w:val="15"/>
@@ -66,6 +225,7 @@
           <w:szCs w:val="24"/>
           <w14:ligatures w14:val="none"/>
         </w:rPr>
+        <w:lastRenderedPageBreak/>
         <w:t>Object → Mirror</w:t>
       </w:r>
       <w:r>
@@ -130,6 +290,122 @@
     <w:p>
       <w:pPr>
         <w:spacing w:before="100" w:beforeAutospacing="1" w:after="100" w:afterAutospacing="1" w:line="240" w:lineRule="auto"/>
+        <w:ind w:left="720" w:hanging="810"/>
+        <w:rPr>
+          <w:rFonts w:ascii="Times New Roman" w:eastAsia="Times New Roman" w:hAnsi="Times New Roman" w:cs="Times New Roman"/>
+          <w:kern w:val="0"/>
+          <w:sz w:val="24"/>
+          <w:szCs w:val="24"/>
+          <w14:ligatures w14:val="none"/>
+        </w:rPr>
+      </w:pPr>
+      <w:r>
+        <w:rPr>
+          <w:rFonts w:ascii="Times New Roman" w:eastAsia="Times New Roman" w:hAnsi="Times New Roman" w:cs="Times New Roman"/>
+          <w:noProof/>
+          <w:kern w:val="0"/>
+          <w:sz w:val="24"/>
+          <w:szCs w:val="24"/>
+          <w14:ligatures w14:val="none"/>
+        </w:rPr>
+        <w:drawing>
+          <wp:inline distT="0" distB="0" distL="0" distR="0" wp14:anchorId="388C688A" wp14:editId="586AE577">
+            <wp:extent cx="3202972" cy="2819400"/>
+            <wp:effectExtent l="76200" t="76200" r="130810" b="133350"/>
+            <wp:docPr id="2124522521" name="Picture 1"/>
+            <wp:cNvGraphicFramePr>
+              <a:graphicFrameLocks xmlns:a="http://schemas.openxmlformats.org/drawingml/2006/main" noChangeAspect="1"/>
+            </wp:cNvGraphicFramePr>
+            <a:graphic xmlns:a="http://schemas.openxmlformats.org/drawingml/2006/main">
+              <a:graphicData uri="http://schemas.openxmlformats.org/drawingml/2006/picture">
+                <pic:pic xmlns:pic="http://schemas.openxmlformats.org/drawingml/2006/picture">
+                  <pic:nvPicPr>
+                    <pic:cNvPr id="2124522521" name=""/>
+                    <pic:cNvPicPr/>
+                  </pic:nvPicPr>
+                  <pic:blipFill rotWithShape="1">
+                    <a:blip r:embed="rId9"/>
+                    <a:srcRect t="15425"/>
+                    <a:stretch>
+                      <a:fillRect/>
+                    </a:stretch>
+                  </pic:blipFill>
+                  <pic:spPr bwMode="auto">
+                    <a:xfrm>
+                      <a:off x="0" y="0"/>
+                      <a:ext cx="3225424" cy="2839163"/>
+                    </a:xfrm>
+                    <a:prstGeom prst="rect">
+                      <a:avLst/>
+                    </a:prstGeom>
+                    <a:ln w="38100" cap="sq">
+                      <a:solidFill>
+                        <a:srgbClr val="000000"/>
+                      </a:solidFill>
+                      <a:prstDash val="solid"/>
+                      <a:miter lim="800000"/>
+                    </a:ln>
+                    <a:effectLst>
+                      <a:outerShdw blurRad="50800" dist="38100" dir="2700000" algn="tl" rotWithShape="0">
+                        <a:srgbClr val="000000">
+                          <a:alpha val="43000"/>
+                        </a:srgbClr>
+                      </a:outerShdw>
+                    </a:effectLst>
+                    <a:extLst>
+                      <a:ext uri="{53640926-AAD7-44D8-BBD7-CCE9431645EC}">
+                        <a14:shadowObscured xmlns:a14="http://schemas.microsoft.com/office/drawing/2010/main"/>
+                      </a:ext>
+                    </a:extLst>
+                  </pic:spPr>
+                </pic:pic>
+              </a:graphicData>
+            </a:graphic>
+          </wp:inline>
+        </w:drawing>
+      </w:r>
+    </w:p>
+    <w:p>
+      <w:pPr>
+        <w:spacing w:before="100" w:beforeAutospacing="1" w:after="100" w:afterAutospacing="1" w:line="240" w:lineRule="auto"/>
+        <w:rPr>
+          <w:rFonts w:ascii="Times New Roman" w:eastAsia="Times New Roman" w:hAnsi="Times New Roman" w:cs="Times New Roman"/>
+          <w:kern w:val="0"/>
+          <w:sz w:val="24"/>
+          <w:szCs w:val="24"/>
+          <w14:ligatures w14:val="none"/>
+        </w:rPr>
+      </w:pPr>
+    </w:p>
+    <w:p>
+      <w:pPr>
+        <w:spacing w:before="100" w:beforeAutospacing="1" w:after="100" w:afterAutospacing="1" w:line="240" w:lineRule="auto"/>
+        <w:rPr>
+          <w:rFonts w:ascii="Times New Roman" w:eastAsia="Times New Roman" w:hAnsi="Times New Roman" w:cs="Times New Roman"/>
+          <w:kern w:val="0"/>
+          <w:sz w:val="24"/>
+          <w:szCs w:val="24"/>
+          <w14:ligatures w14:val="none"/>
+        </w:rPr>
+      </w:pPr>
+    </w:p>
+    <w:p>
+      <w:pPr>
+        <w:pStyle w:val="Heading1"/>
+        <w:rPr>
+          <w:rFonts w:eastAsia="Times New Roman"/>
+        </w:rPr>
+      </w:pPr>
+      <w:r>
+        <w:rPr>
+          <w:rFonts w:eastAsia="Times New Roman"/>
+        </w:rPr>
+        <w:t>Short Cut Keys</w:t>
+      </w:r>
+    </w:p>
+    <w:p>
+      <w:pPr>
+        <w:spacing w:before="100" w:beforeAutospacing="1" w:after="100" w:afterAutospacing="1" w:line="240" w:lineRule="auto"/>
         <w:rPr>
           <w:rFonts w:ascii="Times New Roman" w:eastAsia="Times New Roman" w:hAnsi="Times New Roman" w:cs="Times New Roman"/>
           <w:kern w:val="0"/>
@@ -302,7 +578,29 @@
           <w:szCs w:val="24"/>
           <w14:ligatures w14:val="none"/>
         </w:rPr>
-        <w:t xml:space="preserve">There are also cases where using </w:t>
+        <w:t xml:space="preserve">There are also cases </w:t>
+      </w:r>
+      <w:proofErr w:type="gramStart"/>
+      <w:r>
+        <w:rPr>
+          <w:rFonts w:ascii="Times New Roman" w:eastAsia="Times New Roman" w:hAnsi="Times New Roman" w:cs="Times New Roman"/>
+          <w:kern w:val="0"/>
+          <w:sz w:val="24"/>
+          <w:szCs w:val="24"/>
+          <w14:ligatures w14:val="none"/>
+        </w:rPr>
+        <w:t>where</w:t>
+      </w:r>
+      <w:proofErr w:type="gramEnd"/>
+      <w:r>
+        <w:rPr>
+          <w:rFonts w:ascii="Times New Roman" w:eastAsia="Times New Roman" w:hAnsi="Times New Roman" w:cs="Times New Roman"/>
+          <w:kern w:val="0"/>
+          <w:sz w:val="24"/>
+          <w:szCs w:val="24"/>
+          <w14:ligatures w14:val="none"/>
+        </w:rPr>
+        <w:t xml:space="preserve"> using </w:t>
       </w:r>
       <w:r>
         <w:rPr>
@@ -426,7 +724,7 @@
     </w:p>
     <w:sectPr>
       <w:pgSz w:w="12240" w:h="15840"/>
-      <w:pgMar w:top="1440" w:right="1440" w:bottom="1440" w:left="1440" w:header="720" w:footer="720" w:gutter="0"/>
+      <w:pgMar w:top="360" w:right="1440" w:bottom="1440" w:left="1440" w:header="720" w:footer="720" w:gutter="0"/>
       <w:cols w:space="720"/>
       <w:docGrid w:linePitch="360"/>
     </w:sectPr>

</xml_diff>